<commit_message>
Feat - Melhorias no artigo
</commit_message>
<xml_diff>
--- a/docs/TCC_ARTIGO_ABNT.docx
+++ b/docs/TCC_ARTIGO_ABNT.docx
@@ -23,19 +23,6 @@
         <w:jc w:val="both"/>
       </w:pPr>
       <w:r>
-        <w:rPr>
-          <w:i/>
-        </w:rPr>
-        <w:t>A developer-oriented web application security analysis platform: finding explainability and noise reduction in non-destructive dynamic testing</w:t>
-      </w:r>
-    </w:p>
-    <w:p>
-      <w:pPr>
-        <w:spacing w:line="360" w:lineRule="auto" w:after="120" w:before="0"/>
-        <w:ind w:firstLine="0"/>
-        <w:jc w:val="both"/>
-      </w:pPr>
-      <w:r>
         <w:t>Ricardo José da Silva</w:t>
       </w:r>
     </w:p>
@@ -50,7 +37,7 @@
           <w:i/>
           <w:sz w:val="20"/>
         </w:rPr>
-        <w:t>Acadêmico do curso de Engenharia de Software, Centro Universitário Leonardo da Vinci (UNIASSELVI). Turma EGS0011 — Experiência Profissional (TCC). E-mail institucional do autor. Orientador(a): [inserir nome].</w:t>
+        <w:t>Acadêmico do curso de Engenharia de Software, Centro Universitário Leonardo da Vinci (UNIASSELVI). Turma EGS0011 — Experiência Profissional (TCC). E-mail: [inserir e-mail]. Orientador(a): [inserir nome do orientador].</w:t>
       </w:r>
     </w:p>
     <w:p>
@@ -75,25 +62,7 @@
         <w:jc w:val="both"/>
       </w:pPr>
       <w:r>
-        <w:t xml:space="preserve">A avaliação de segurança de aplicações web frequentemente ocorre de forma tardia e pontual em equipes de desenvolvimento que não dispõem de um profissional dedicado à segurança da informação, o que permite que vulnerabilidades permaneçam desconhecidas até etapas avançadas do ciclo de vida do software, elevando o custo de correção. Ferramentas automatizadas de teste dinâmico (DAST) existem há décadas, mas a literatura registra que desenvolvedores as subutilizam por produzirem grande volume de resultados de difícil interpretação, com muitos falsos positivos e baixa orientação à correção. Este trabalho apresenta o SentinelScope, uma plataforma web de apoio à análise de segurança concebida sob a ótica do desenvolvedor, cujo objetivo é identificar possíveis vulnerabilidades e apresentar cada achado com severidade, confiança, evidência e orientação prática de correção, de modo verificável e não destrutivo. A solução foi construída como uma aplicação PHP sem framework, apoiada por um motor de varredura em Python organizado em camadas, com plugins passivos (34 verificações de transporte, cabeçalhos, cookies, CORS, cache, exposição de informação e de segredos) e plugins ativos seguros (injeção de SQL, XSS refletido, travessia de diretório, redirecionamento aberto, injeção de comando, SSTI, XXE, CRLF, host header, adulteração de verbo HTTP, injeção NoSQL, CORS e SSRF), todos submetidos a salvaguardas de escopo, orçamento de requisições e negação de alvos privados. Um diferencial central é a separação explícita entre </w:t>
-      </w:r>
-      <w:r>
-        <w:rPr>
-          <w:i/>
-        </w:rPr>
-        <w:t>severidade</w:t>
-      </w:r>
-      <w:r>
-        <w:t xml:space="preserve"> (impacto potencial) e </w:t>
-      </w:r>
-      <w:r>
-        <w:rPr>
-          <w:i/>
-        </w:rPr>
-        <w:t>confiança</w:t>
-      </w:r>
-      <w:r>
-        <w:t xml:space="preserve"> (força da evidência), além de uma camada de explicabilidade que traduz cada observação técnica em impacto para a aplicação e recomendação de correção em linguagem acessível, acompanhada de um exemplo de código "vulnerável → corrigido". A ferramenta ainda testa campos de formulário via POST e alcança áreas autenticadas por cabeçalho de sessão. A verificação foi conduzida por meio de uma suíte de 94 testes automatizados que exercitam cada plugin contra fixtures vulneráveis e seguros usando um servidor HTTP local real. Conclui-se que uma ferramenta de apoio orientada à explicabilidade e à redução de ruído é tecnicamente viável no escopo acadêmico e endereça uma lacuna reconhecida entre a capacidade de detecção e a capacidade de ação do desenvolvedor; propõe-se, como continuidade, uma avaliação empírica comparativa contra aplicações deliberadamente vulneráveis.</w:t>
+        <w:t>A avaliação de segurança de aplicações web costuma ocorrer de forma tardia e pontual em equipes de desenvolvimento que não dispõem de um profissional dedicado à segurança da informação. Com isso, vulnerabilidades permanecem desconhecidas até etapas avançadas do ciclo de vida do software, o que eleva o custo de correção. Ferramentas automatizadas de teste dinâmico (DAST) existem há décadas, mas a literatura registra que os desenvolvedores as subutilizam. Elas produzem grande volume de resultados de difícil interpretação, com muitos falsos positivos e pouca orientação de correção. Este trabalho apresenta o SentinelScope, uma plataforma web de apoio à análise de segurança pensada sob a ótica do desenvolvedor. Seu objetivo é identificar possíveis vulnerabilidades e apresentar cada achado com severidade, confiança, evidência e orientação prática de correção, de modo verificável e não destrutivo. A solução foi construída como uma aplicação PHP sem framework, apoiada por um motor de varredura em Python organizado em camadas. O motor reúne verificações passivas (34 checagens de transporte, cabeçalhos, cookies, CORS, cache, exposição de informação e de segredos) e verificações ativas seguras (injeção de SQL, XSS refletido, travessia de diretório, redirecionamento aberto, injeção de comando, SSTI, XXE, CRLF, host header, adulteração de verbo HTTP, injeção NoSQL, CORS e SSRF). Todas operam sob salvaguardas de escopo, orçamento de requisições e negação de alvos privados. Um diferencial central é separar a severidade, que expressa o impacto potencial, da confiança, que expressa a força da evidência. A esse desenho soma-se uma camada de explicabilidade, que traduz cada observação técnica em impacto para a aplicação e em recomendação de correção acessível, acompanhada de um exemplo de código "vulnerável → corrigido". A ferramenta também testa campos de formulário via POST e alcança áreas autenticadas por cabeçalho de sessão. A verificação foi conduzida por uma suíte de 94 testes automatizados, que exercitam cada plugin contra fixtures vulneráveis e seguros em um servidor HTTP local real. Conclui-se que uma ferramenta de apoio orientada à explicabilidade e à redução de ruído é tecnicamente viável no escopo acadêmico e ataca uma lacuna reconhecida entre a capacidade de detecção e a capacidade de ação do desenvolvedor. Como continuidade, propõe-se uma avaliação empírica comparativa contra aplicações deliberadamente vulneráveis.</w:t>
       </w:r>
     </w:p>
     <w:p>
@@ -110,65 +79,6 @@
       </w:r>
       <w:r>
         <w:t xml:space="preserve"> segurança de aplicações web; teste dinâmico de segurança (DAST); OWASP Top 10; usabilidade de ferramentas de segurança; DevSecOps.</w:t>
-      </w:r>
-    </w:p>
-    <w:p>
-      <w:pPr>
-        <w:spacing w:line="360" w:lineRule="auto" w:after="120" w:before="240"/>
-        <w:ind w:firstLine="0"/>
-        <w:jc w:val="left"/>
-      </w:pPr>
-      <w:r>
-        <w:rPr>
-          <w:b/>
-          <w:color w:val="000000"/>
-          <w:sz w:val="24"/>
-        </w:rPr>
-        <w:t>ABSTRACT</w:t>
-      </w:r>
-    </w:p>
-    <w:p>
-      <w:pPr>
-        <w:spacing w:line="360" w:lineRule="auto" w:after="120" w:before="0"/>
-        <w:ind w:firstLine="0"/>
-        <w:jc w:val="both"/>
-      </w:pPr>
-      <w:r>
-        <w:t xml:space="preserve">Security assessment of web applications is often performed late and sporadically in development teams that lack a dedicated information-security professional, allowing vulnerabilities to remain unknown until advanced stages of the software life cycle and raising remediation costs. Dynamic Application Security Testing (DAST) tools have existed for decades, yet the literature reports that developers underuse them because they produce large volumes of hard-to-interpret results, many false positives, and little remediation guidance. This work presents SentinelScope, a developer-centered web security analysis support platform whose goal is to identify possible vulnerabilities and present each finding with severity, confidence, evidence, and practical remediation guidance, in a verifiable and non-destructive manner. The solution was built as a framework-less PHP application supported by a layered Python scanning engine, with passive plugins (34 checks over transport, headers, cookies, CORS, cache, information and secrets exposure) and safe-active plugins (SQL injection, reflected XSS, path traversal, open redirect, command injection, SSTI, XXE, CRLF, host header, HTTP verb tampering, NoSQL injection, CORS and SSRF), all subject to scope enforcement, request budgets, and private-target denial. A central contribution is the explicit separation between </w:t>
-      </w:r>
-      <w:r>
-        <w:rPr>
-          <w:i/>
-        </w:rPr>
-        <w:t>severity</w:t>
-      </w:r>
-      <w:r>
-        <w:t xml:space="preserve"> (potential impact) and </w:t>
-      </w:r>
-      <w:r>
-        <w:rPr>
-          <w:i/>
-        </w:rPr>
-        <w:t>confidence</w:t>
-      </w:r>
-      <w:r>
-        <w:t xml:space="preserve"> (evidence strength), plus an explainability layer that translates each technical observation into application impact and a remediation recommendation in accessible language, accompanied by a concrete "vulnerable → fixed" code example. The tool also tests form fields via POST and reaches authenticated areas through a session header. Verification was conducted through a suite of 94 automated tests exercising each plugin against vulnerable and safe fixtures on a real local HTTP server. We conclude that a support tool oriented to explainability and noise reduction is technically feasible within an academic scope and addresses a recognized gap between detection capability and the developer's ability to act; a comparative empirical evaluation against deliberately vulnerable applications is proposed as future work.</w:t>
-      </w:r>
-    </w:p>
-    <w:p>
-      <w:pPr>
-        <w:spacing w:line="360" w:lineRule="auto" w:after="120" w:before="0"/>
-        <w:ind w:firstLine="0"/>
-        <w:jc w:val="both"/>
-      </w:pPr>
-      <w:r>
-        <w:rPr>
-          <w:b/>
-        </w:rPr>
-        <w:t>Keywords:</w:t>
-      </w:r>
-      <w:r>
-        <w:t xml:space="preserve"> web application security; dynamic application security testing (DAST); OWASP Top 10; security tooling usability; DevSecOps.</w:t>
       </w:r>
     </w:p>
     <w:p>
@@ -193,7 +103,7 @@
         <w:jc w:val="both"/>
       </w:pPr>
       <w:r>
-        <w:t>O software tornou-se o principal meio pelo qual organizações prestam serviços, e a aplicação web permanece uma das superfícies de ataque mais expostas, por ser acessível pela rede pública e por concentrar dados sensíveis. À medida que o número de aplicações mantidas por uma mesma equipe cresce, cresce também a dificuldade de garantir que cada nova versão ou manutenção não introduza falhas de segurança. Em equipes que não contam com um profissional dedicado exclusivamente à segurança da informação — cenário comum em pequenas e médias operações de desenvolvimento —, as verificações de segurança tendem a ocorrer de maneira pontual e não a cada entrega, permitindo que vulnerabilidades permaneçam desconhecidas até etapas posteriores do ciclo de vida do software (McGRAW, 2006).</w:t>
+        <w:t>O software tornou-se o principal meio pelo qual organizações prestam serviços, e a aplicação web permanece uma das superfícies de ataque mais expostas, por ser acessível pela rede pública e por concentrar dados sensíveis. À medida que o número de aplicações mantidas por uma mesma equipe cresce, cresce também a dificuldade de garantir que cada nova versão ou manutenção não introduza falhas de segurança. Em equipes que não contam com um profissional dedicado exclusivamente à segurança da informação, cenário comum em pequenas e médias operações de desenvolvimento, as verificações tendem a ocorrer de maneira pontual, e não a cada entrega. Como resultado, vulnerabilidades permanecem desconhecidas até etapas posteriores do ciclo de vida do software (McGRAW, 2006).</w:t>
       </w:r>
     </w:p>
     <w:p>
@@ -203,7 +113,7 @@
         <w:jc w:val="both"/>
       </w:pPr>
       <w:r>
-        <w:t xml:space="preserve">Esse adiamento tem custo. É princípio consolidado da engenharia de software que o custo de corrigir um defeito cresce à medida que ele avança pelas fases do ciclo de desenvolvimento, sendo substancialmente maior quando descoberto em produção do que quando detectado durante a construção (BOEHM, 1981). No caso específico da segurança, o defeito tardio não implica apenas retrabalho: implica exposição indevida de informação, correções emergenciais e risco de incidente. Daí decorre o movimento contemporâneo conhecido como </w:t>
+        <w:t xml:space="preserve">Esse adiamento tem custo. É princípio consolidado da engenharia de software que o custo de corrigir um defeito cresce à medida que ele avança pelas fases do ciclo de desenvolvimento, sendo substancialmente maior quando descoberto em produção do que quando detectado durante a construção (BOEHM, 1981). No caso específico da segurança, o defeito tardio vai além do retrabalho. Ele pode significar exposição indevida de informação, correções emergenciais e risco de incidente. Desse contexto emerge o movimento conhecido como </w:t>
       </w:r>
       <w:r>
         <w:rPr>
@@ -222,7 +132,7 @@
         <w:jc w:val="both"/>
       </w:pPr>
       <w:r>
-        <w:t xml:space="preserve">A automação é o instrumento natural dessa antecipação, e as ferramentas de </w:t>
+        <w:t xml:space="preserve">A automação é o instrumento natural dessa antecipação. As ferramentas de </w:t>
       </w:r>
       <w:r>
         <w:rPr>
@@ -231,25 +141,7 @@
         <w:t>Dynamic Application Security Testing</w:t>
       </w:r>
       <w:r>
-        <w:t xml:space="preserve"> (DAST) — que analisam a aplicação em execução, sem acesso ao código-fonte — existem há décadas. Entretanto, a literatura empírica é consistente ao apontar duas limitações que reduzem sua adoção efetiva pelos desenvolvedores. A primeira é de eficácia: estudos independentes demonstram que scanners de caixa-preta divergem significativamente entre si e deixam de detectar classes inteiras de vulnerabilidade, ao mesmo tempo em que geram falsos positivos (DOUPÉ; COVA; VIGNA, 2010; BAU et al., 2010; FONSECA; VIEIRA; MADEIRA, 2007). A segunda, e mais determinante para este trabalho, é de usabilidade: mesmo quando a ferramenta acerta, seus resultados são frequentemente apresentados em uma linguagem técnica orientada ao especialista em segurança, sem explicar </w:t>
-      </w:r>
-      <w:r>
-        <w:rPr>
-          <w:i/>
-        </w:rPr>
-        <w:t>por que</w:t>
-      </w:r>
-      <w:r>
-        <w:t xml:space="preserve"> aquilo importa para a aplicação específica e </w:t>
-      </w:r>
-      <w:r>
-        <w:rPr>
-          <w:i/>
-        </w:rPr>
-        <w:t>como</w:t>
-      </w:r>
-      <w:r>
-        <w:t xml:space="preserve"> corrigir no código. Johnson et al. (2013), ao investigarem por que desenvolvedores não usam ferramentas de análise estática, identificam justamente o excesso de falsos positivos e a apresentação inadequada dos resultados como barreiras centrais; Green e Smith (2016) argumentam que ferramentas e APIs de segurança precisam ser projetadas para o desenvolvedor comum, e não para o especialista, sob pena de serem ignoradas.</w:t>
+        <w:t xml:space="preserve"> (DAST), que analisam a aplicação em execução sem acesso ao código-fonte, existem há décadas. Ainda assim, a literatura empírica aponta de forma consistente duas limitações que reduzem sua adoção pelos desenvolvedores. A primeira é de eficácia. Estudos independentes mostram que scanners de caixa-preta divergem bastante entre si e deixam de detectar classes inteiras de vulnerabilidade, ao mesmo tempo em que geram falsos positivos (DOUPÉ; COVA; VIGNA, 2010; BAU et al., 2010; FONSECA; VIEIRA; MADEIRA, 2007). A segunda, mais determinante para este trabalho, é de usabilidade. Mesmo quando a ferramenta acerta, seus resultados costumam vir em linguagem técnica voltada ao especialista, sem explicar por que aquilo importa para a aplicação específica e como corrigir no código. Johnson et al. (2013), ao investigarem por que desenvolvedores não usam ferramentas de análise estática, identificam justamente o excesso de falsos positivos e a apresentação inadequada dos resultados como barreiras centrais; Green e Smith (2016) argumentam que ferramentas e APIs de segurança precisam ser projetadas para o desenvolvedor comum, e não para o especialista, sob pena de serem ignoradas.</w:t>
       </w:r>
     </w:p>
     <w:p>
@@ -302,7 +194,7 @@
         <w:jc w:val="both"/>
       </w:pPr>
       <w:r>
-        <w:t>Como oferecer a equipes de desenvolvimento sem especialista dedicado uma avaliação inicial de segurança de aplicações web que seja, simultaneamente, automatizada, não destrutiva, incorporável à rotina e — sobretudo — apresentada de forma que o próprio desenvolvedor compreenda o risco e consiga corrigi-lo?</w:t>
+        <w:t>Como oferecer a equipes de desenvolvimento sem especialista dedicado uma avaliação inicial de segurança de aplicações web que seja, ao mesmo tempo, automatizada, não destrutiva, incorporável à rotina e, sobretudo, apresentada de forma que o próprio desenvolvedor compreenda o risco e consiga corrigi-lo?</w:t>
       </w:r>
     </w:p>
     <w:p>
@@ -421,16 +313,7 @@
         <w:jc w:val="both"/>
       </w:pPr>
       <w:r>
-        <w:t xml:space="preserve">A relevância do tema decorre da conjunção entre a criticidade das vulnerabilidades web — sistematicamente catalogadas pelo OWASP Top 10 (OWASP, 2021) — e a subutilização documentada das ferramentas que deveriam mitigá-las (JOHNSON et al., 2013; GREEN; SMITH, 2016). Ao deslocar o foco da mera detecção para a </w:t>
-      </w:r>
-      <w:r>
-        <w:rPr>
-          <w:i/>
-        </w:rPr>
-        <w:t>explicabilidade e acionabilidade</w:t>
-      </w:r>
-      <w:r>
-        <w:t xml:space="preserve"> do achado, o trabalho posiciona-se sobre uma lacuna reconhecida na literatura e de valor prático direto para o cenário descrito no termo de referência do projeto: uma equipe que mantém mais de cinco aplicações internas sem apoio especializado em segurança. Academicamente, o trabalho articula três corpos de conhecimento — teste de segurança automatizado, taxonomias de vulnerabilidade e usabilidade de ferramentas de segurança — em um artefato verificável.</w:t>
+        <w:t>A relevância do tema nasce da combinação de dois fatores. De um lado, as vulnerabilidades web são críticas e estão sistematicamente catalogadas pelo OWASP Top 10 (OWASP, 2021). De outro, as ferramentas que deveriam mitigá-las são comprovadamente subutilizadas (JOHNSON et al., 2013; GREEN; SMITH, 2016). Ao deslocar o foco da simples detecção para a explicabilidade e a acionabilidade do achado, o trabalho se posiciona sobre uma lacuna reconhecida na literatura, com valor prático direto para o cenário descrito no termo de referência do projeto: uma equipe que mantém mais de cinco aplicações internas sem apoio especializado em segurança. No plano acadêmico, o trabalho articula três corpos de conhecimento em um artefato verificável: teste de segurança automatizado, taxonomias de vulnerabilidade e usabilidade de ferramentas de segurança.</w:t>
       </w:r>
     </w:p>
     <w:p>
@@ -455,16 +338,7 @@
         <w:jc w:val="both"/>
       </w:pPr>
       <w:r>
-        <w:t xml:space="preserve">Trata-se de uma ferramenta de </w:t>
-      </w:r>
-      <w:r>
-        <w:rPr>
-          <w:b/>
-        </w:rPr>
-        <w:t>apoio</w:t>
-      </w:r>
-      <w:r>
-        <w:t>, e não de substituição de auditoria especializada ou teste de intrusão profissional. Deliberadamente, exclui-se a exploração automática ou destrutiva das vulnerabilidades (a proposta é comprovar a existência do problema com a evidência mínima necessária, sem comprometer disponibilidade, integridade ou dados), a análise de código-fonte (a solução não pressupõe acesso ao repositório) e o monitoramento contínuo em tempo real. A primeira versão limita-se ao conjunto de verificações implementado e não pretende detectar todas as classes de vulnerabilidade existentes. Estas delimitações são retomadas na Seção 6.</w:t>
+        <w:t>Trata-se de uma ferramenta de apoio, e não de substituição de auditoria especializada ou de teste de intrusão profissional. Três frentes ficam deliberadamente fora do escopo. A primeira é a exploração automática ou destrutiva das vulnerabilidades, pois a proposta é comprovar a existência do problema com a evidência mínima necessária, sem comprometer disponibilidade, integridade ou dados. A segunda é a análise de código-fonte, já que a solução não pressupõe acesso ao repositório. A terceira é o monitoramento contínuo em tempo real. Além disso, a primeira versão limita-se ao conjunto de verificações implementado e não pretende detectar todas as classes de vulnerabilidade existentes. Estas delimitações são retomadas na Seção 6.</w:t>
       </w:r>
     </w:p>
     <w:p>
@@ -504,16 +378,7 @@
         <w:jc w:val="left"/>
       </w:pPr>
       <w:r>
-        <w:t xml:space="preserve">Construir segurança </w:t>
-      </w:r>
-      <w:r>
-        <w:rPr>
-          <w:i/>
-        </w:rPr>
-        <w:t>dentro</w:t>
-      </w:r>
-      <w:r>
-        <w:t xml:space="preserve"> do software, em vez de acoplá-la ao final, é a tese central da disciplina de segurança de software (McGRAW, 2006; VIEGA; McGRAW, 2001). Essa perspectiva contrapõe-se ao modelo em que a segurança é tratada como uma etapa de auditoria posterior à construção. O argumento econômico que a sustenta é clássico: o custo de remoção de um defeito cresce de forma acentuada conforme ele progride pelas fases do ciclo de vida (BOEHM, 1981). Transposto para a segurança, isso significa que uma falha detectada durante o desenvolvimento é incomparavelmente mais barata de corrigir do que a mesma falha explorada em produção. O movimento </w:t>
+        <w:t xml:space="preserve">Construir segurança dentro do software, em vez de acoplá-la ao final, é a tese central da disciplina de segurança de software (McGRAW, 2006; VIEGA; McGRAW, 2001). Essa perspectiva se contrapõe ao modelo em que a segurança é tratada como uma etapa de auditoria posterior à construção. O argumento econômico que a sustenta é clássico: o custo de remover um defeito cresce de forma acentuada conforme ele avança pelas fases do ciclo de vida (BOEHM, 1981). Aplicado à segurança, isso quer dizer que uma falha detectada durante o desenvolvimento é muito mais barata de corrigir do que a mesma falha explorada em produção. O movimento </w:t>
       </w:r>
       <w:r>
         <w:rPr>
@@ -531,7 +396,7 @@
         <w:t>shift-left security</w:t>
       </w:r>
       <w:r>
-        <w:t xml:space="preserve"> operacionalizam essa ideia, integrando verificações de segurança automatizadas ao fluxo contínuo de desenvolvimento e entrega (SHOSTACK, 2014).</w:t>
+        <w:t xml:space="preserve"> colocam essa ideia em operação, integrando verificações de segurança automatizadas ao fluxo contínuo de desenvolvimento e entrega (SHOSTACK, 2014).</w:t>
       </w:r>
     </w:p>
     <w:p>
@@ -703,7 +568,7 @@
         <w:t>Static Application Security Testing</w:t>
       </w:r>
       <w:r>
-        <w:t xml:space="preserve"> (SAST) analisa o código-fonte sem executá-lo; o </w:t>
+        <w:t xml:space="preserve"> (SAST) analisa o código-fonte sem executá-lo. Já o </w:t>
       </w:r>
       <w:r>
         <w:rPr>
@@ -712,7 +577,7 @@
         <w:t>Dynamic Application Security Testing</w:t>
       </w:r>
       <w:r>
-        <w:t xml:space="preserve"> (DAST) analisa a aplicação em execução, observando e provocando seu comportamento pela interface externa, sem necessariamente acessar o código (BAU et al., 2010). Cada abordagem tem pontos cegos complementares: o SAST enxerga o código mas não o comportamento em tempo de execução, ao passo que o DAST enxerga o comportamento mas não a causa no código. O SentinelScope situa-se na abordagem DAST, coerente com a delimitação de não pressupor acesso ao repositório.</w:t>
+        <w:t xml:space="preserve"> (DAST) analisa a aplicação em execução, observando e provocando seu comportamento pela interface externa, sem necessariamente acessar o código (BAU et al., 2010). As duas têm pontos cegos complementares. O SAST enxerga o código, mas não o comportamento em tempo de execução; o DAST enxerga o comportamento, mas não a causa no código. O SentinelScope se situa na abordagem DAST, coerente com a delimitação de não pressupor acesso ao repositório.</w:t>
       </w:r>
     </w:p>
     <w:p>
@@ -722,7 +587,44 @@
         <w:jc w:val="left"/>
       </w:pPr>
       <w:r>
-        <w:t xml:space="preserve">A eficácia dos scanners DAST de caixa-preta, contudo, é limitada e desigual. Doupé, Cova e Vigna (2010), em avaliação que ficou conhecida pelo título "Why Johnny Can't Pentest", demonstraram que scanners automáticos falham sistematicamente ao lidar com o estado da aplicação e deixam de alcançar partes relevantes da superfície de ataque. Bau et al. (2010) e Fonseca, Vieira e Madeira (2007) documentaram ampla variação de cobertura entre ferramentas e a coexistência de falsos negativos e falsos positivos, especialmente em injeção de SQL e XSS. Antunes e Vieira (2010) propuseram </w:t>
+        <w:t xml:space="preserve">Uma consequência prática dessa escolha é que o DAST exige uma instância da aplicação em execução e acessível ao scanner. Isso não significa, porém, que a aplicação precise estar publicada na internet. Na rotina de desenvolvimento, o alvo pode ser a própria máquina do desenvolvedor (por exemplo, um endereço de </w:t>
+      </w:r>
+      <w:r>
+        <w:rPr>
+          <w:i/>
+        </w:rPr>
+        <w:t>localhost</w:t>
+      </w:r>
+      <w:r>
+        <w:t xml:space="preserve">), um servidor de homologação interno ou um ambiente efêmero criado por um </w:t>
+      </w:r>
+      <w:r>
+        <w:rPr>
+          <w:i/>
+        </w:rPr>
+        <w:t>pipeline</w:t>
+      </w:r>
+      <w:r>
+        <w:t xml:space="preserve"> de integração contínua. É por essa razão que o motor prevê, como opção explícita de laboratório, a análise de alvos em rede privada (Seção 3.3). Assim, o modelo de uso permanece compatível com o </w:t>
+      </w:r>
+      <w:r>
+        <w:rPr>
+          <w:i/>
+        </w:rPr>
+        <w:t>shift-left</w:t>
+      </w:r>
+      <w:r>
+        <w:t>: testa-se cedo e com frequência, tão logo exista um build executável, sem depender de uma implantação pública.</w:t>
+      </w:r>
+    </w:p>
+    <w:p>
+      <w:pPr>
+        <w:spacing w:line="240" w:lineRule="auto" w:after="240" w:before="0"/>
+        <w:ind w:firstLine="0"/>
+        <w:jc w:val="left"/>
+      </w:pPr>
+      <w:r>
+        <w:t xml:space="preserve">A eficácia dos scanners DAST de caixa-preta, no entanto, é limitada e desigual. Doupé, Cova e Vigna (2010), em avaliação que ficou conhecida pelo título "Why Johnny Can't Pentest", demonstraram que os scanners automáticos falham de forma sistemática ao lidar com o estado da aplicação e deixam de alcançar partes relevantes da superfície de ataque. Bau et al. (2010) e Fonseca, Vieira e Madeira (2007) documentaram ampla variação de cobertura entre ferramentas, além da coexistência de falsos negativos e falsos positivos, sobretudo em injeção de SQL e XSS. Antunes e Vieira (2010) propuseram </w:t>
       </w:r>
       <w:r>
         <w:rPr>
@@ -731,16 +633,7 @@
         <w:t>benchmarks</w:t>
       </w:r>
       <w:r>
-        <w:t xml:space="preserve"> para tornar essa comparação metodologicamente rigorosa. A lição para este trabalho é dupla: (i) nenhuma ferramenta automatizada deve ser apresentada como garantia de ausência de vulnerabilidades — o que fundamenta o posicionamento de </w:t>
-      </w:r>
-      <w:r>
-        <w:rPr>
-          <w:i/>
-        </w:rPr>
-        <w:t>apoio</w:t>
-      </w:r>
-      <w:r>
-        <w:t>; e (ii) a redução de falsos positivos e a qualificação da confiança de cada achado não são refinamentos opcionais, mas requisitos centrais de utilidade.</w:t>
+        <w:t xml:space="preserve"> para tornar essa comparação metodologicamente rigorosa. A lição para este trabalho é dupla. Primeiro, nenhuma ferramenta automatizada deve ser apresentada como garantia de ausência de vulnerabilidades, o que fundamenta o posicionamento de apoio. Segundo, reduzir falsos positivos e qualificar a confiança de cada achado não são refinamentos opcionais, e sim requisitos centrais de utilidade.</w:t>
       </w:r>
     </w:p>
     <w:p>
@@ -765,16 +658,7 @@
         <w:jc w:val="left"/>
       </w:pPr>
       <w:r>
-        <w:t xml:space="preserve">A terceira base teórica desloca o foco da máquina para a pessoa. Mesmo ferramentas tecnicamente competentes fracassam quando seus resultados não são acionáveis. Johnson et al. (2013), em estudo qualitativo com desenvolvedores, concluíram que a subutilização de ferramentas de análise decorre principalmente de dois fatores: o volume de falsos positivos e a forma como os resultados são comunicados — sem explicação suficiente e sem integração com o fluxo de trabalho. Bessey et al. (2010), relatando anos de uso industrial de análise estática, reforçam que a confiança do desenvolvedor no resultado é um recurso frágil: poucos falsos positivos ruidosos bastam para que a ferramenta seja abandonada. Smith et al. (2015) mapearam as perguntas que desenvolvedores fazem ao diagnosticar um alerta de segurança, revelando que a informação de que precisam raramente é a mesma que as ferramentas oferecem. Acar et al. (2016) mostraram, experimentalmente, que a </w:t>
-      </w:r>
-      <w:r>
-        <w:rPr>
-          <w:i/>
-        </w:rPr>
-        <w:t>fonte</w:t>
-      </w:r>
-      <w:r>
-        <w:t xml:space="preserve"> de informação usada pelo desenvolvedor influencia diretamente a segurança do código produzido — evidência de que orientação clara e correta embutida na ferramenta tem efeito prático mensurável. Green e Smith (2016) sintetizam esse conjunto em um princípio de projeto: "desenvolvedores não são o inimigo"; a segurança utilizável precisa encontrá-los onde eles estão, com linguagem e exemplos que eles compreendam.</w:t>
+        <w:t>A terceira base teórica desloca o foco da máquina para a pessoa. Mesmo ferramentas tecnicamente competentes fracassam quando seus resultados não são acionáveis. Johnson et al. (2013), em estudo qualitativo com desenvolvedores, concluíram que a subutilização das ferramentas de análise decorre principalmente de dois fatores: o volume de falsos positivos e a forma como os resultados são comunicados, sem explicação suficiente e sem integração com o fluxo de trabalho. Bessey et al. (2010), relatando anos de uso industrial de análise estática, reforçam que a confiança do desenvolvedor no resultado é um recurso frágil. Poucos falsos positivos ruidosos já bastam para que a ferramenta seja abandonada. Smith et al. (2015) mapearam as perguntas que os desenvolvedores fazem ao diagnosticar um alerta de segurança e revelaram que a informação de que eles precisam raramente é a que as ferramentas oferecem. Acar et al. (2016) mostraram, de forma experimental, que a fonte de informação usada pelo desenvolvedor influencia diretamente a segurança do código produzido. É uma evidência de que orientação clara e correta embutida na ferramenta tem efeito prático mensurável. Green e Smith (2016) resumem esse conjunto em um princípio de projeto: "desenvolvedores não são o inimigo". A segurança utilizável precisa encontrá-los onde eles estão, com linguagem e exemplos que compreendam.</w:t>
       </w:r>
     </w:p>
     <w:p>
@@ -784,16 +668,7 @@
         <w:jc w:val="left"/>
       </w:pPr>
       <w:r>
-        <w:t xml:space="preserve">Essa literatura fundamenta a hipótese de projeto do SentinelScope: </w:t>
-      </w:r>
-      <w:r>
-        <w:rPr>
-          <w:b/>
-        </w:rPr>
-        <w:t>o valor de um achado de segurança para o desenvolvedor não está apenas em detectá-lo, mas em explicá-lo e torná-lo corrigível</w:t>
-      </w:r>
-      <w:r>
-        <w:t>. A separação entre severidade e confiança, a supressão de sinais instáveis e a apresentação em três camadas (o que se observou, por que importa, como corrigir) são respostas diretas às barreiras identificadas por Johnson et al. (2013) e Green e Smith (2016).</w:t>
+        <w:t>Essa literatura fundamenta a hipótese de projeto do SentinelScope: para o desenvolvedor, o valor de um achado de segurança não está apenas em detectá-lo, mas em explicá-lo e torná-lo corrigível. A separação entre severidade e confiança, a supressão de sinais instáveis e a apresentação em três camadas (o que se observou, por que importa e como corrigir) são respostas diretas às barreiras identificadas por Johnson et al. (2013) e Green e Smith (2016).</w:t>
       </w:r>
     </w:p>
     <w:p>
@@ -842,7 +717,7 @@
         <w:t>pesquisa aplicada</w:t>
       </w:r>
       <w:r>
-        <w:t xml:space="preserve">, pois gera um artefato de software destinado a uso prático. Quanto aos objetivos, é </w:t>
+        <w:t xml:space="preserve">, pois gera um artefato de software destinado a uso prático (GIL, 2002; PRODANOV; FREITAS, 2013). Quanto aos objetivos, é </w:t>
       </w:r>
       <w:r>
         <w:rPr>
@@ -851,7 +726,7 @@
         <w:t>exploratória e descritiva</w:t>
       </w:r>
       <w:r>
-        <w:t xml:space="preserve">. Quanto ao procedimento, adota o método de </w:t>
+        <w:t xml:space="preserve"> (GIL, 2002). Quanto ao procedimento, adota o método de </w:t>
       </w:r>
       <w:r>
         <w:rPr>
@@ -860,7 +735,7 @@
         <w:t>pesquisa de desenvolvimento (ou pesquisa-artefato)</w:t>
       </w:r>
       <w:r>
-        <w:t xml:space="preserve">, no qual o conhecimento é produzido pela construção e avaliação de um artefato tecnológico que responde a um problema real. A abordagem é predominantemente </w:t>
+        <w:t xml:space="preserve">, no qual o conhecimento é produzido pela construção e avaliação de um artefato tecnológico que responde a um problema real (WAZLAWICK, 2014). A abordagem é predominantemente </w:t>
       </w:r>
       <w:r>
         <w:rPr>
@@ -903,7 +778,7 @@
         <w:jc w:val="both"/>
       </w:pPr>
       <w:r>
-        <w:t>A plataforma foi construída com PHP 8.2 (sem framework), Python 3.10 (sem dependências externas ao interpretador padrão), banco de dados MariaDB 10.4 e interface em HTML e CSS sem framework de front-end. A opção deliberada por não utilizar frameworks visou manter o código auditável e explícito, adequado a um trabalho acadêmico em que cada decisão precisa ser justificável, e reduzir a superfície de dependências de terceiros. O ambiente de desenvolvimento e teste utilizou a pilha XAMPP sobre Windows 11. O controle de versão foi feito com Git.</w:t>
+        <w:t>A plataforma foi construída com PHP 8.2 (sem framework), Python 3.10 (sem dependências externas ao interpretador padrão), banco de dados MariaDB 10.4 e interface em HTML e CSS sem framework de front-end. A opção deliberada por não utilizar frameworks visou manter o código auditável e explícito, adequado a um trabalho acadêmico em que cada decisão precisa ser justificável, e reduzir a superfície de dependências de terceiros. O ambiente de desenvolvimento e teste utilizou a pilha XAMPP sobre Windows 11. O controle de versão foi feito com Git. A redação, a estrutura e a apresentação deste artigo seguem as normas da Associação Brasileira de Normas Técnicas para trabalhos acadêmicos e artigos científicos (ABNT, 2011, 2018, 2023).</w:t>
       </w:r>
     </w:p>
     <w:p>
@@ -989,7 +864,7 @@
         <w:t>testes automatizados com fixtures controlados</w:t>
       </w:r>
       <w:r>
-        <w:t>: para cada verificação implementada, construiu-se pelo menos um alvo deliberadamente vulnerável e um alvo seguro/endurecido, servidos por um servidor HTTP local real (sockets reais, tempo real, bytes reais na rede), de modo que um teste aprovado signifique que a verificação funciona contra um servidor de fato, e não apenas contra objetos de resposta fabricados em memória. Essa decisão metodológica responde diretamente ao risco de falsos positivos discutido na Seção 2.3. A cobertura e os resultados são apresentados na Seção 5.</w:t>
+        <w:t>, organizada em níveis (unidade, integração e aceitação) segundo a prática consolidada de teste de software (PRESSMAN; MAXIM, 2016): para cada verificação implementada, construiu-se pelo menos um alvo deliberadamente vulnerável e um alvo seguro/endurecido, servidos por um servidor HTTP local real (sockets reais, tempo real, bytes reais na rede), de modo que um teste aprovado signifique que a verificação funciona contra um servidor de fato, e não apenas contra objetos de resposta fabricados em memória. Essa decisão metodológica responde diretamente ao risco de falsos positivos discutido na Seção 2.3. A cobertura e os resultados são apresentados na Seção 5.</w:t>
       </w:r>
     </w:p>
     <w:p>
@@ -1058,7 +933,7 @@
         <w:jc w:val="both"/>
       </w:pPr>
       <w:r>
-        <w:t>A separação entre a aplicação web (PHP) e o motor de varredura (Python) não é acidental: isola o componente que executa requisições potencialmente sensíveis em um processo com fronteira e orçamento próprios, e permite que o motor evolua e seja testado de forma independente da camada de apresentação.</w:t>
+        <w:t>A separação entre a aplicação web (PHP) e o motor de varredura (Python) não é acidental. Ela isola o componente que executa requisições potencialmente sensíveis em um processo com fronteira e orçamento próprios. Também permite que o motor evolua e seja testado de forma independente da camada de apresentação. Trata-se da aplicação direta dos princípios de baixo acoplamento e alta coesão da engenharia de software (PRESSMAN; MAXIM, 2016; SOMMERVILLE, 2018).</w:t>
       </w:r>
     </w:p>
     <w:p>
@@ -1346,7 +1221,7 @@
         <w:jc w:val="both"/>
       </w:pPr>
       <w:r>
-        <w:t>Cada família de vulnerabilidade é implementada como uma classe de plugin que declara seus próprios metadados (categoria, CWE, OWASP, WSTG, tipo e risco operacional) e o conjunto de identificadores de verificação que possui. Duas modalidades coexistem:</w:t>
+        <w:t>Cada família de vulnerabilidade é implementada como uma classe de plugin que declara seus próprios metadados (categoria, CWE, OWASP, WSTG, tipo e risco operacional) e o conjunto de identificadores de verificação que possui, ancorados nos catálogos internacionais correspondentes (OWASP, 2021; MITRE, 2024; OWASP, 2020). Duas modalidades coexistem:</w:t>
       </w:r>
     </w:p>
     <w:p>
@@ -1487,16 +1362,7 @@
         <w:jc w:val="both"/>
       </w:pPr>
       <w:r>
-        <w:t xml:space="preserve">Como ilustração do rigor do modo ativo, o plugin de injeção de SQL tenta as técnicas em ordem crescente de custo — baseada em erro, diferencial booleano e, por fim, baseada em tempo — e </w:t>
-      </w:r>
-      <w:r>
-        <w:rPr>
-          <w:b/>
-        </w:rPr>
-        <w:t>para na primeira técnica que produz evidência confirmada</w:t>
-      </w:r>
-      <w:r>
-        <w:t>, sem jamais enumerar tabelas ou extrair registros. A técnica de diferencial booleano emprega o contraste entre uma condição logicamente verdadeira (</w:t>
+        <w:t>Um exemplo ilustra o rigor do modo ativo. Seguindo as orientações de teste do OWASP WSTG (OWASP, 2020), o plugin de injeção de SQL tenta as técnicas em ordem crescente de custo: primeiro a baseada em erro, depois a diferencial booleana e, por fim, a baseada em tempo. A cadeia para na primeira técnica que produz evidência confirmada, e o plugin nunca enumera tabelas nem extrai registros. A técnica de diferencial booleano compara uma condição logicamente verdadeira (</w:t>
       </w:r>
       <w:r>
         <w:rPr>
@@ -1515,7 +1381,7 @@
         <w:t>baseline</w:t>
       </w:r>
       <w:r>
-        <w:t>, e uma condição falsa (</w:t>
+        <w:t>, com uma condição falsa (</w:t>
       </w:r>
       <w:r>
         <w:rPr>
@@ -1525,7 +1391,7 @@
         <w:t>' AND '1'='2</w:t>
       </w:r>
       <w:r>
-        <w:t xml:space="preserve">), que deve divergir, acompanhado de um </w:t>
+        <w:t xml:space="preserve">), que deve divergir, além de um </w:t>
       </w:r>
       <w:r>
         <w:rPr>
@@ -1534,7 +1400,7 @@
         <w:t>probe</w:t>
       </w:r>
       <w:r>
-        <w:t xml:space="preserve"> de controle inócuo — construção que evita o erro comum de usar </w:t>
+        <w:t xml:space="preserve"> de controle inócuo. Essa construção evita um erro comum: usar </w:t>
       </w:r>
       <w:r>
         <w:rPr>
@@ -1544,7 +1410,7 @@
         <w:t>OR '1'='1'</w:t>
       </w:r>
       <w:r>
-        <w:t xml:space="preserve"> sobre um parâmetro cujo valor de </w:t>
+        <w:t xml:space="preserve"> em um parâmetro cujo valor de </w:t>
       </w:r>
       <w:r>
         <w:rPr>
@@ -1553,7 +1419,7 @@
         <w:t>baseline</w:t>
       </w:r>
       <w:r>
-        <w:t xml:space="preserve"> já é verdadeiro, o que nunca divergiria e produziria conclusão inválida.</w:t>
+        <w:t xml:space="preserve"> já é verdadeiro, o que nunca divergiria e levaria a uma conclusão inválida.</w:t>
       </w:r>
     </w:p>
     <w:p>
@@ -1578,34 +1444,7 @@
         <w:jc w:val="both"/>
       </w:pPr>
       <w:r>
-        <w:t xml:space="preserve">Um dos contributos centrais do trabalho é tratar </w:t>
-      </w:r>
-      <w:r>
-        <w:rPr>
-          <w:b/>
-        </w:rPr>
-        <w:t>severidade</w:t>
-      </w:r>
-      <w:r>
-        <w:t xml:space="preserve"> e </w:t>
-      </w:r>
-      <w:r>
-        <w:rPr>
-          <w:b/>
-        </w:rPr>
-        <w:t>confiança</w:t>
-      </w:r>
-      <w:r>
-        <w:t xml:space="preserve"> como dimensões independentes. Severidade responde "quão grave seria isto se fosse verdadeiro"; confiança responde "quão seguro o detector está de que é verdadeiro". Um achado crítico com evidência fraca permanece </w:t>
-      </w:r>
-      <w:r>
-        <w:rPr>
-          <w:i/>
-        </w:rPr>
-        <w:t>crítico de baixa confiança</w:t>
-      </w:r>
-      <w:r>
-        <w:t xml:space="preserve"> — nunca é rebaixado silenciosamente para uma severidade menor para "compensar" a incerteza, prática que ocultaria riscos reais do desenvolvedor.</w:t>
+        <w:t>Uma das contribuições centrais do trabalho é tratar severidade e confiança como dimensões independentes. Essa distinção dialoga com a filosofia do CVSS, que expressa o impacto de uma vulnerabilidade de modo estruturado e separado de outras dimensões (FIRST, 2019). A severidade responde à pergunta "quão grave seria isto se fosse verdadeiro". A confiança responde a outra: "quão seguro o detector está de que é verdadeiro". Um achado crítico com evidência fraca permanece como crítico de baixa confiança. Ele nunca é rebaixado em silêncio para uma severidade menor apenas para compensar a incerteza, uma prática que esconderia riscos reais do desenvolvedor.</w:t>
       </w:r>
     </w:p>
     <w:p>
@@ -1635,7 +1474,7 @@
         <w:jc w:val="both"/>
       </w:pPr>
       <w:r>
-        <w:t xml:space="preserve">O resultado, limitado a 0–100, é mapeado para um </w:t>
+        <w:t xml:space="preserve">O resultado, limitado ao intervalo de 0 a 100, é traduzido em um </w:t>
       </w:r>
       <w:r>
         <w:rPr>
@@ -1644,7 +1483,7 @@
         <w:t>status</w:t>
       </w:r>
       <w:r>
-        <w:t xml:space="preserve"> legível (</w:t>
+        <w:t xml:space="preserve"> legível: </w:t>
       </w:r>
       <w:r>
         <w:rPr>
@@ -1698,7 +1537,7 @@
         <w:t>revisão manual necessária</w:t>
       </w:r>
       <w:r>
-        <w:t xml:space="preserve">). Por construção, verificações puramente passivas e de observação única não alcançam o </w:t>
+        <w:t xml:space="preserve">. Por construção, verificações puramente passivas e de observação única não alcançam o </w:t>
       </w:r>
       <w:r>
         <w:rPr>
@@ -1707,7 +1546,7 @@
         <w:t>status</w:t>
       </w:r>
       <w:r>
-        <w:t xml:space="preserve"> "confirmado", reservado a detecções ativas que reproduzem o resultado por uma técnica independente. Esse desenho é a resposta direta do trabalho à advertência de Bessey et al. (2010) e Johnson et al. (2013) sobre o custo dos falsos positivos: em vez de afirmar mais do que a evidência sustenta, a ferramenta comunica explicitamente seu grau de certeza e sinaliza o que requer revisão humana.</w:t>
+        <w:t xml:space="preserve"> "confirmado", reservado a detecções ativas que reproduzem o resultado por uma técnica independente. Esse desenho responde diretamente à advertência de Bessey et al. (2010) e Johnson et al. (2013) sobre o custo dos falsos positivos. Em vez de afirmar mais do que a evidência sustenta, a ferramenta comunica de forma explícita o seu grau de certeza e sinaliza o que exige revisão humana.</w:t>
       </w:r>
     </w:p>
     <w:p>
@@ -1732,7 +1571,7 @@
         <w:jc w:val="both"/>
       </w:pPr>
       <w:r>
-        <w:t xml:space="preserve">Antes de qualquer comparação entre respostas, a normalização remove o conteúdo volátil que, se ignorado, geraria diferenças espúrias e, portanto, falsos positivos. Sinais instáveis — por exemplo, um texto de erro presente em apenas uma de duas requisições de </w:t>
+        <w:t xml:space="preserve">Antes de qualquer comparação entre respostas, a normalização remove o conteúdo volátil que, se fosse ignorado, geraria diferenças espúrias e, portanto, falsos positivos. Alguns sinais são instáveis, como um texto de erro presente em apenas uma de duas requisições de </w:t>
       </w:r>
       <w:r>
         <w:rPr>
@@ -1741,7 +1580,7 @@
         <w:t>baseline</w:t>
       </w:r>
       <w:r>
-        <w:t xml:space="preserve">, ou um valor de alta entropia que muda entre requisições (token rotativo) — são rebaixados a "revisão manual necessária" ou excluídos, em vez de confirmados. O contexto de página mantém a severidade proporcional: uma resposta que não é HTML não é penalizada por ausência de </w:t>
+        <w:t xml:space="preserve"> ou um valor de alta entropia que muda a cada requisição (um token rotativo). Nesses casos, o achado é rebaixado a "revisão manual necessária" ou excluído, em vez de confirmado. O contexto de página mantém a severidade proporcional. Uma resposta que não é HTML, por exemplo, não é penalizada pela ausência de </w:t>
       </w:r>
       <w:r>
         <w:rPr>
@@ -1750,7 +1589,7 @@
         <w:t>Content-Security-Policy</w:t>
       </w:r>
       <w:r>
-        <w:t>, por exemplo. Essas decisões implementam, no plano técnico, o requisito de utilidade discutido na Seção 2.4.</w:t>
+        <w:t>. No plano técnico, essas decisões concretizam o requisito de utilidade discutido na Seção 2.4.</w:t>
       </w:r>
     </w:p>
     <w:p>
@@ -1861,16 +1700,7 @@
         <w:jc w:val="both"/>
       </w:pPr>
       <w:r>
-        <w:t xml:space="preserve">O exemplo de correção é o elemento que distingue a explicabilidade proposta: em vez de descrever a correção em abstrato, a ferramenta a </w:t>
-      </w:r>
-      <w:r>
-        <w:rPr>
-          <w:i/>
-        </w:rPr>
-        <w:t>mostra</w:t>
-      </w:r>
-      <w:r>
-        <w:t>. Cada uma das verificações que um plugin pode emitir possui um par de trechos autorado uma única vez em uma tabela central (</w:t>
+        <w:t>O exemplo de correção é o que distingue a explicabilidade proposta. Em vez de descrever a correção de forma abstrata, a ferramenta a mostra. Cada verificação que um plugin pode emitir tem um par de trechos, escrito uma única vez em uma tabela central (</w:t>
       </w:r>
       <w:r>
         <w:rPr>
@@ -1880,7 +1710,7 @@
         <w:t>plugins/remediation_examples.py</w:t>
       </w:r>
       <w:r>
-        <w:t>) e mesclado a todo achado no momento de sua construção. Essa decisão responde diretamente às conclusões de Smith et al. (2015) sobre as perguntas que o desenvolvedor faz diante de um alerta — frequentemente "como eu conserto isto no meu código?" — e ao efeito, demonstrado por Acar et al. (2016), de que a fonte de informação embutida na ferramenta influencia a segurança do código produzido.</w:t>
+        <w:t>) e mesclado a todo achado no momento de sua construção. Essa decisão responde diretamente às conclusões de Smith et al. (2015) sobre as perguntas que o desenvolvedor faz diante de um alerta, muitas vezes "como eu conserto isto no meu código?". Responde também ao efeito demonstrado por Acar et al. (2016): a fonte de informação embutida na ferramenta influencia a segurança do código produzido.</w:t>
       </w:r>
     </w:p>
     <w:p>
@@ -1890,16 +1720,7 @@
         <w:jc w:val="both"/>
       </w:pPr>
       <w:r>
-        <w:t xml:space="preserve">Abaixo dessas camadas, um painel recolhível de </w:t>
-      </w:r>
-      <w:r>
-        <w:rPr>
-          <w:i/>
-        </w:rPr>
-        <w:t>contexto técnico</w:t>
-      </w:r>
-      <w:r>
-        <w:t xml:space="preserve"> expõe o identificador da verificação, a taxonomia completa (categoria, CWE, OWASP, WSTG), a URL/parâmetro afetado e a evidência estruturada em JSON, para quem quiser aprofundar. Severidade e confiança são exibidas como selos distintos. Esse formato materializa o princípio de Green e Smith (2016): a informação de que o desenvolvedor precisa vem primeiro, em sua linguagem; o detalhe para o especialista fica disponível, mas subordinado.</w:t>
+        <w:t>Abaixo dessas camadas, um painel recolhível de contexto técnico reúne o identificador da verificação, a taxonomia completa (categoria, CWE, OWASP e WSTG), a URL e o parâmetro afetados e a evidência estruturada em JSON, para quem quiser aprofundar. Severidade e confiança aparecem como selos distintos. Esse formato concretiza o princípio de Green e Smith (2016): a informação de que o desenvolvedor precisa vem primeiro, na linguagem dele, enquanto o detalhe para o especialista fica disponível, porém em segundo plano.</w:t>
       </w:r>
     </w:p>
     <w:p>
@@ -1924,7 +1745,7 @@
         <w:jc w:val="both"/>
       </w:pPr>
       <w:r>
-        <w:t xml:space="preserve">Boa parte da superfície de risco de uma aplicação só é acessível após autenticação. Para alcançá-la sem acoplar um mecanismo de </w:t>
+        <w:t xml:space="preserve">Boa parte da superfície de risco de uma aplicação só fica acessível após a autenticação. Para alcançá-la sem acoplar um mecanismo de </w:t>
       </w:r>
       <w:r>
         <w:rPr>
@@ -1933,7 +1754,7 @@
         <w:t>login</w:t>
       </w:r>
       <w:r>
-        <w:t xml:space="preserve"> específico, o motor aceita cabeçalhos de autenticação (tipicamente um </w:t>
+        <w:t xml:space="preserve"> específico, o motor aceita cabeçalhos de autenticação, em geral um </w:t>
       </w:r>
       <w:r>
         <w:rPr>
@@ -1951,7 +1772,7 @@
         <w:t>token</w:t>
       </w:r>
       <w:r>
-        <w:t xml:space="preserve"> Bearer) que são anexados a toda requisição — passiva ou ativa — no único ponto de saída HTTP autorizado. Por construção, esses cabeçalhos só trafegam para o host e a porta fixados pelo controle de escopo, são redigidos no registro de requisições e, na aplicação web, são usados de forma transitória em uma análise e nunca persistidos. Assim, uma única extensão localizada habilita a varredura autenticada para todas as verificações existentes de uma vez, sem alterar nenhum plugin.</w:t>
+        <w:t xml:space="preserve"> Bearer, e os anexa a toda requisição, passiva ou ativa, no único ponto de saída HTTP autorizado. Por construção, esses cabeçalhos só trafegam para o host e a porta fixados pelo controle de escopo e são ocultados no registro de requisições. Na aplicação web, eles são usados de forma transitória em uma única análise e nunca ficam armazenados. Dessa forma, uma extensão pequena e localizada habilita a varredura autenticada para todas as verificações de uma vez, sem alterar nenhum plugin.</w:t>
       </w:r>
     </w:p>
     <w:p>
@@ -1976,52 +1797,34 @@
         <w:jc w:val="both"/>
       </w:pPr>
       <w:r>
-        <w:t xml:space="preserve">Cada análise concluída recebe uma </w:t>
-      </w:r>
-      <w:r>
-        <w:rPr>
-          <w:b/>
-        </w:rPr>
-        <w:t>Pontuação de Segurança</w:t>
-      </w:r>
-      <w:r>
-        <w:t xml:space="preserve"> de 0 a 100, calculada por uma regra determinística: a pontuação parte de 100 e cada achado crítico, alto, médio ou baixo desconta, respectivamente, 30, 15, 7 e 2 pontos, com resultado limitado a 0–100. A regra é intencionalmente simples e reprodutível, adequada à </w:t>
+        <w:t xml:space="preserve">Cada análise concluída recebe uma Pontuação de Segurança de 0 a 100, calculada por uma regra determinística. A pontuação parte de 100 e cada achado crítico, alto, médio ou baixo desconta 30, 15, 7 e 2 pontos, respectivamente, com o resultado limitado ao intervalo de 0 a 100. A regra é propositalmente simples e reprodutível, adequada à comparação entre análises da mesma aplicação. Ela não pretende ser uma medida universal de segurança, e essa limitação é assumida de forma explícita na interface e neste artigo. O histórico por aplicação e a comparação entre duas análises sustentam o uso incremental da ferramenta ao longo das entregas: cada achado recebe uma impressão digital estável, o que permite classificá-lo como </w:t>
       </w:r>
       <w:r>
         <w:rPr>
           <w:i/>
         </w:rPr>
-        <w:t>comparação</w:t>
-      </w:r>
-      <w:r>
-        <w:t xml:space="preserve"> entre análises da mesma aplicação; não pretende ser uma medida universal de segurança — limitação assumida explicitamente na interface e nesta monografia. O histórico por aplicação e a comparação entre duas análises (classificando achados em </w:t>
+        <w:t>novo</w:t>
+      </w:r>
+      <w:r>
+        <w:t xml:space="preserve">, </w:t>
       </w:r>
       <w:r>
         <w:rPr>
           <w:i/>
         </w:rPr>
-        <w:t>novos</w:t>
-      </w:r>
-      <w:r>
-        <w:t xml:space="preserve">, </w:t>
+        <w:t>ainda presente</w:t>
+      </w:r>
+      <w:r>
+        <w:t xml:space="preserve"> ou </w:t>
       </w:r>
       <w:r>
         <w:rPr>
           <w:i/>
         </w:rPr>
-        <w:t>ainda presentes</w:t>
-      </w:r>
-      <w:r>
-        <w:t xml:space="preserve"> e </w:t>
-      </w:r>
-      <w:r>
-        <w:rPr>
-          <w:i/>
-        </w:rPr>
-        <w:t>corrigidos</w:t>
-      </w:r>
-      <w:r>
-        <w:t xml:space="preserve">, por meio de uma impressão digital estável de cada achado) sustentam o uso incremental da ferramenta ao longo das entregas. Para integração com o fluxo de trabalho da equipe, a interface ainda permite filtrar os achados por severidade, copiar o exemplo de correção com um clique e exportar a análise concluída em JSON legível por máquina, adequado a </w:t>
+        <w:t>corrigido</w:t>
+      </w:r>
+      <w:r>
+        <w:t xml:space="preserve">. Para integrar-se ao fluxo de trabalho da equipe, a interface também permite filtrar os achados por severidade, copiar o exemplo de correção com um clique e exportar a análise concluída em JSON legível por máquina, adequado a </w:t>
       </w:r>
       <w:r>
         <w:rPr>
@@ -2055,7 +1858,7 @@
         <w:jc w:val="both"/>
       </w:pPr>
       <w:r>
-        <w:t xml:space="preserve">A própria aplicação foi construída sob as práticas que ela verifica: mutações exigem </w:t>
+        <w:t xml:space="preserve">A própria aplicação foi construída sob as mesmas práticas que ela verifica, em coerência com o princípio de embutir segurança desde o projeto (McGRAW, 2006; OWASP, 2021). As operações que alteram dados exigem um </w:t>
       </w:r>
       <w:r>
         <w:rPr>
@@ -2064,7 +1867,7 @@
         <w:t>token</w:t>
       </w:r>
       <w:r>
-        <w:t xml:space="preserve"> CSRF vinculado à sessão; toda a saída passa por codificação para mitigar XSS armazenado; todo acesso ao banco usa </w:t>
+        <w:t xml:space="preserve"> CSRF vinculado à sessão. Toda a saída passa por codificação, o que mitiga o XSS armazenado. E todo acesso ao banco usa </w:t>
       </w:r>
       <w:r>
         <w:rPr>
@@ -2073,7 +1876,7 @@
         <w:t>prepared statements</w:t>
       </w:r>
       <w:r>
-        <w:t xml:space="preserve"> nativos, prevenindo injeção de SQL. A versão acadêmica assume instalação local monousuário confiável; autenticação e controle de acesso por papéis são recomendados antes de qualquer implantação compartilhada.</w:t>
+        <w:t xml:space="preserve"> nativos, o que previne a injeção de SQL. A versão acadêmica pressupõe uma instalação local, monousuário e confiável; para qualquer implantação compartilhada, recomendam-se autenticação e controle de acesso por papéis.</w:t>
       </w:r>
     </w:p>
     <w:p>
@@ -2141,7 +1944,7 @@
         <w:t>40 verificações no lado PHP</w:t>
       </w:r>
       <w:r>
-        <w:t>. A suíte cobre vários níveis: a fundação do motor (</w:t>
+        <w:t>. A suíte cobre os níveis clássicos de teste (PRESSMAN; MAXIM, 2016): a fundação do motor (</w:t>
       </w:r>
       <w:r>
         <w:rPr>
@@ -2664,35 +2467,35 @@
         <w:jc w:val="both"/>
       </w:pPr>
       <w:r>
-        <w:t xml:space="preserve">Os resultados sustentam a viabilidade técnica da proposta e, sobretudo, a viabilidade do seu diferencial: é possível construir, no escopo de um trabalho acadêmico, um motor DAST não destrutivo que qualifica a confiança de cada achado e reduz ruído por normalização e verificação de estabilidade. A cobertura de testes contra fixtures seguros — e não apenas vulneráveis — é a evidência de que a ferramenta foi projetada para </w:t>
+        <w:t>Os resultados sustentam a viabilidade técnica da proposta e, principalmente, a viabilidade do seu diferencial. É possível construir, no escopo de um trabalho acadêmico, um motor DAST não destrutivo que qualifica a confiança de cada achado e reduz o ruído por normalização e verificação de estabilidade. A cobertura de testes inclui fixtures seguros, e não apenas vulneráveis. Essa é a evidência de que a ferramenta foi projetada para não soar o alarme diante de configurações corretas, um requisito que a literatura aponta como decisivo para a adoção (JOHNSON et al., 2013; BESSEY et al., 2010).</w:t>
+      </w:r>
+    </w:p>
+    <w:p>
+      <w:pPr>
+        <w:spacing w:line="360" w:lineRule="auto" w:after="0" w:before="0"/>
+        <w:ind w:firstLine="709"/>
+        <w:jc w:val="both"/>
+      </w:pPr>
+      <w:r>
+        <w:t xml:space="preserve">Cabe, porém, distinguir com honestidade o que foi verificado do que ainda não foi. Os testes comprovam que cada verificação funciona como especificado contra alvos controlados. Eles ainda não medem o desempenho da ferramenta contra uma aplicação real e desconhecida, ou seja, sua taxa de detecção (revocação, do inglês </w:t>
       </w:r>
       <w:r>
         <w:rPr>
           <w:i/>
         </w:rPr>
-        <w:t>não gritar</w:t>
-      </w:r>
-      <w:r>
-        <w:t xml:space="preserve"> diante de configurações corretas, requisito que a literatura aponta como decisivo para a adoção (JOHNSON et al., 2013; BESSEY et al., 2010).</w:t>
-      </w:r>
-    </w:p>
-    <w:p>
-      <w:pPr>
-        <w:spacing w:line="360" w:lineRule="auto" w:after="0" w:before="0"/>
-        <w:ind w:firstLine="709"/>
-        <w:jc w:val="both"/>
-      </w:pPr>
-      <w:r>
-        <w:t xml:space="preserve">Cabe, porém, distinguir com honestidade o que foi verificado do que ainda não foi. Os testes comprovam que cada verificação </w:t>
+        <w:t>recall</w:t>
+      </w:r>
+      <w:r>
+        <w:t xml:space="preserve">) e sua taxa de acerto entre os alertas emitidos (precisão, do inglês </w:t>
       </w:r>
       <w:r>
         <w:rPr>
-          <w:b/>
+          <w:i/>
         </w:rPr>
-        <w:t>funciona como especificado contra alvos controlados</w:t>
-      </w:r>
-      <w:r>
-        <w:t>. Eles não medem, ainda, o desempenho da ferramenta contra uma aplicação real e desconhecida — isto é, sua taxa de detecção (recall) e sua taxa de falsos positivos (precision) em condições não controladas. Essa é a fronteira entre o que este trabalho entrega e o que a Seção 5.3 propõe.</w:t>
+        <w:t>precision</w:t>
+      </w:r>
+      <w:r>
+        <w:t>) em condições não controladas. Essa é a fronteira entre o que este trabalho entrega e o que a Seção 5.3 propõe.</w:t>
       </w:r>
     </w:p>
     <w:p>
@@ -2791,7 +2594,7 @@
         <w:t>baseline</w:t>
       </w:r>
       <w:r>
-        <w:t>, ferramenta livre amplamente utilizada, como referência de mercado;</w:t>
+        <w:t xml:space="preserve"> (OWASP, 2024), ferramenta livre amplamente utilizada, como referência de mercado;</w:t>
       </w:r>
     </w:p>
     <w:p>
@@ -2810,7 +2613,7 @@
         <w:t>Métricas.</w:t>
       </w:r>
       <w:r>
-        <w:t xml:space="preserve"> Para cada classe de vulnerabilidade conhecida no alvo, apurar verdadeiros positivos, falsos positivos e falsos negativos, derivando </w:t>
+        <w:t xml:space="preserve"> Para cada classe de vulnerabilidade conhecida no alvo, apurar verdadeiros positivos, falsos positivos e falsos negativos, derivando precisão (</w:t>
       </w:r>
       <w:r>
         <w:rPr>
@@ -2819,7 +2622,7 @@
         <w:t>precision</w:t>
       </w:r>
       <w:r>
-        <w:t xml:space="preserve">, </w:t>
+        <w:t>), revocação (</w:t>
       </w:r>
       <w:r>
         <w:rPr>
@@ -2828,16 +2631,7 @@
         <w:t>recall</w:t>
       </w:r>
       <w:r>
-        <w:t xml:space="preserve"> e </w:t>
-      </w:r>
-      <w:r>
-        <w:rPr>
-          <w:i/>
-        </w:rPr>
-        <w:t>F1</w:t>
-      </w:r>
-      <w:r>
-        <w:t>, além do tempo de execução e do número de requisições emitidas;</w:t>
+        <w:t>) e a medida F1, além do tempo de execução e do número de requisições emitidas;</w:t>
       </w:r>
     </w:p>
     <w:p>
@@ -3391,43 +3185,7 @@
         <w:jc w:val="both"/>
       </w:pPr>
       <w:r>
-        <w:t xml:space="preserve">Reconhecem-se as seguintes limitações. </w:t>
-      </w:r>
-      <w:r>
-        <w:rPr>
-          <w:b/>
-        </w:rPr>
-        <w:t>De construção:</w:t>
-      </w:r>
-      <w:r>
-        <w:t xml:space="preserve"> o esquema de pontuação é uma heurística de comparação, não uma medida absoluta de segurança. </w:t>
-      </w:r>
-      <w:r>
-        <w:rPr>
-          <w:b/>
-        </w:rPr>
-        <w:t>De cobertura:</w:t>
-      </w:r>
-      <w:r>
-        <w:t xml:space="preserve"> o conjunto de verificações é finito e não detecta todas as classes de vulnerabilidade; falhas de lógica de negócio e vulnerabilidades que dependem de estado autenticado complexo estão além do alcance de um scanner black-box, conforme já demonstrado por Doupé, Cova e Vigna (2010). </w:t>
-      </w:r>
-      <w:r>
-        <w:rPr>
-          <w:b/>
-        </w:rPr>
-        <w:t>De avaliação:</w:t>
-      </w:r>
-      <w:r>
-        <w:t xml:space="preserve"> como discutido, a eficácia em alvos reais ainda não foi medida (Seção 5.3). </w:t>
-      </w:r>
-      <w:r>
-        <w:rPr>
-          <w:b/>
-        </w:rPr>
-        <w:t>De generalização:</w:t>
-      </w:r>
-      <w:r>
-        <w:t xml:space="preserve"> os testes automatizados usam alvos controlados construídos pelo próprio autor, o que exige a avaliação independente proposta para mitigar viés. Essas limitações não invalidam a contribuição, mas delimitam com precisão o alcance das conclusões — postura que a própria literatura de scanners recomenda como antídoto ao exagero de capacidade (BAU et al., 2010).</w:t>
+        <w:t>Reconhecem-se quatro limitações. A primeira é de construção: o esquema de pontuação é uma heurística de comparação, não uma medida absoluta de segurança. A segunda é de cobertura: o conjunto de verificações é finito e não detecta todas as classes de vulnerabilidade. Falhas de lógica de negócio e vulnerabilidades que dependem de estado autenticado complexo estão além do alcance de um scanner de caixa-preta, como já demonstraram Doupé, Cova e Vigna (2010). A terceira é de avaliação: como discutido, a eficácia em alvos reais ainda não foi medida (Seção 5.3). A quarta é de generalização: os testes automatizados usam alvos controlados construídos pelo próprio autor, o que torna necessária a avaliação independente proposta para reduzir o viés. Essas limitações não invalidam a contribuição, mas delimitam com precisão o alcance das conclusões. Essa é, aliás, a postura que a própria literatura de scanners recomenda como antídoto ao exagero de capacidade (BAU et al., 2010).</w:t>
       </w:r>
     </w:p>
     <w:p>
@@ -3452,25 +3210,7 @@
         <w:jc w:val="both"/>
       </w:pPr>
       <w:r>
-        <w:t xml:space="preserve">Este trabalho partiu de um problema concreto e recorrente — equipes de desenvolvimento sem apoio especializado em segurança, verificando suas aplicações de forma tardia e pontual — e de uma lacuna reconhecida na literatura: a distância entre a capacidade de </w:t>
-      </w:r>
-      <w:r>
-        <w:rPr>
-          <w:i/>
-        </w:rPr>
-        <w:t>detectar</w:t>
-      </w:r>
-      <w:r>
-        <w:t xml:space="preserve"> vulnerabilidades e a capacidade de o desenvolvedor </w:t>
-      </w:r>
-      <w:r>
-        <w:rPr>
-          <w:i/>
-        </w:rPr>
-        <w:t>agir</w:t>
-      </w:r>
-      <w:r>
-        <w:t xml:space="preserve"> sobre elas. A resposta construída, o SentinelScope, é uma plataforma DAST de apoio, não destrutiva, que ancora seus achados em taxonomias consolidadas (OWASP Top 10, CWE, WSTG), separa explicitamente severidade de confiança, reduz ruído por normalização e verificação de estabilidade, e — sobretudo — apresenta cada achado em uma camada de explicabilidade orientada à correção.</w:t>
+        <w:t>Este trabalho partiu de um problema concreto e recorrente: equipes de desenvolvimento sem apoio especializado em segurança, que verificam suas aplicações de forma tardia e pontual. Partiu também de uma lacuna reconhecida na literatura, a distância entre a capacidade de detectar vulnerabilidades e a capacidade de o desenvolvedor agir sobre elas. A resposta construída, o SentinelScope, é uma plataforma DAST de apoio, não destrutiva. Ela ancora seus achados em taxonomias consolidadas (OWASP Top 10, CWE e WSTG), separa de forma explícita a severidade da confiança, reduz o ruído por normalização e verificação de estabilidade e, acima de tudo, apresenta cada achado em uma camada de explicabilidade orientada à correção.</w:t>
       </w:r>
     </w:p>
     <w:p>
@@ -3770,6 +3510,25 @@
         <w:jc w:val="left"/>
       </w:pPr>
       <w:r>
+        <w:t xml:space="preserve">GIL, Antônio Carlos. </w:t>
+      </w:r>
+      <w:r>
+        <w:rPr>
+          <w:b/>
+        </w:rPr>
+        <w:t>Como elaborar projetos de pesquisa</w:t>
+      </w:r>
+      <w:r>
+        <w:t>. 4. ed. São Paulo: Atlas, 2002.</w:t>
+      </w:r>
+    </w:p>
+    <w:p>
+      <w:pPr>
+        <w:spacing w:line="240" w:lineRule="auto" w:after="240" w:before="0"/>
+        <w:ind w:firstLine="0"/>
+        <w:jc w:val="left"/>
+      </w:pPr>
+      <w:r>
         <w:t xml:space="preserve">GREEN, Matthew; SMITH, Matthew. Developers are Not the Enemy!: The Need for Usable Security APIs. </w:t>
       </w:r>
       <w:r>
@@ -3893,7 +3652,45 @@
         <w:t>OWASP ZAP — Zed Attack Proxy</w:t>
       </w:r>
       <w:r>
-        <w:t>. [S. l.]: OWASP. Disponível em: https://www.zaproxy.org/. Acesso em: 8 set. 2026.</w:t>
+        <w:t>. Versão 2.15. [S. l.]: OWASP, 2024. Disponível em: https://www.zaproxy.org/. Acesso em: 8 set. 2026.</w:t>
+      </w:r>
+    </w:p>
+    <w:p>
+      <w:pPr>
+        <w:spacing w:line="240" w:lineRule="auto" w:after="240" w:before="0"/>
+        <w:ind w:firstLine="0"/>
+        <w:jc w:val="left"/>
+      </w:pPr>
+      <w:r>
+        <w:t xml:space="preserve">PRESSMAN, Roger S.; MAXIM, Bruce R. </w:t>
+      </w:r>
+      <w:r>
+        <w:rPr>
+          <w:b/>
+        </w:rPr>
+        <w:t>Engenharia de software</w:t>
+      </w:r>
+      <w:r>
+        <w:t>: uma abordagem profissional. 8. ed. Porto Alegre: AMGH, 2016.</w:t>
+      </w:r>
+    </w:p>
+    <w:p>
+      <w:pPr>
+        <w:spacing w:line="240" w:lineRule="auto" w:after="240" w:before="0"/>
+        <w:ind w:firstLine="0"/>
+        <w:jc w:val="left"/>
+      </w:pPr>
+      <w:r>
+        <w:t xml:space="preserve">PRODANOV, Cleber Cristiano; FREITAS, Ernani Cesar de. </w:t>
+      </w:r>
+      <w:r>
+        <w:rPr>
+          <w:b/>
+        </w:rPr>
+        <w:t>Metodologia do trabalho científico</w:t>
+      </w:r>
+      <w:r>
+        <w:t>: métodos e técnicas da pesquisa e do trabalho acadêmico. 2. ed. Novo Hamburgo: Feevale, 2013.</w:t>
       </w:r>
     </w:p>
     <w:p>
@@ -3960,6 +3757,25 @@
         <w:jc w:val="left"/>
       </w:pPr>
       <w:r>
+        <w:t xml:space="preserve">SOMMERVILLE, Ian. </w:t>
+      </w:r>
+      <w:r>
+        <w:rPr>
+          <w:b/>
+        </w:rPr>
+        <w:t>Engenharia de software</w:t>
+      </w:r>
+      <w:r>
+        <w:t>. 10. ed. São Paulo: Pearson Education do Brasil, 2018.</w:t>
+      </w:r>
+    </w:p>
+    <w:p>
+      <w:pPr>
+        <w:spacing w:line="240" w:lineRule="auto" w:after="240" w:before="0"/>
+        <w:ind w:firstLine="0"/>
+        <w:jc w:val="left"/>
+      </w:pPr>
+      <w:r>
         <w:t xml:space="preserve">VIEGA, John; McGRAW, Gary. </w:t>
       </w:r>
       <w:r>
@@ -3970,6 +3786,25 @@
       </w:r>
       <w:r>
         <w:t>: How to Avoid Security Problems the Right Way. Boston: Addison-Wesley, 2001.</w:t>
+      </w:r>
+    </w:p>
+    <w:p>
+      <w:pPr>
+        <w:spacing w:line="240" w:lineRule="auto" w:after="240" w:before="0"/>
+        <w:ind w:firstLine="0"/>
+        <w:jc w:val="left"/>
+      </w:pPr>
+      <w:r>
+        <w:t xml:space="preserve">WAZLAWICK, Raul Sidnei. </w:t>
+      </w:r>
+      <w:r>
+        <w:rPr>
+          <w:b/>
+        </w:rPr>
+        <w:t>Metodologia de pesquisa para ciência da computação</w:t>
+      </w:r>
+      <w:r>
+        <w:t>. 2. ed. Rio de Janeiro: Elsevier, 2014.</w:t>
       </w:r>
     </w:p>
     <w:sectPr>

</xml_diff>